<commit_message>
Update build log: enquiry form and globe rework
Co-Authored-By: Claude Sonnet 5.5 <noreply@anthropic.com>
</commit_message>
<xml_diff>
--- a/docs/DYMUN26-Build-Log.docx
+++ b/docs/DYMUN26-Build-Log.docx
@@ -36,7 +36,7 @@
         <w:rPr>
           <w:rFonts w:ascii="Courier New" w:cs="Courier New" w:eastAsia="Courier New" w:hAnsi="Courier New"/>
         </w:rPr>
-        <w:t xml:space="preserve">Build session 8 to 9 October 2026, about 55 minutes. Updated after the PR.</w:t>
+        <w:t xml:space="preserve">Build session 8 to 9 October 2026, about 55 minutes. Updated after the globe rework.</w:t>
       </w:r>
     </w:p>
     <w:p>
@@ -1076,7 +1076,127 @@
                 <w:sz w:val="18"/>
                 <w:szCs w:val="18"/>
               </w:rPr>
-              <w:t xml:space="preserve">This log (Word, Courier New) added on branch docs/build-log; pull request opened into main.</w:t>
+              <w:t xml:space="preserve">This log (Word, Courier New) added on branch docs/build-log; pull request 1 opened into main. Vercel preview check reports "Deployment was blocked" (not caused by the log; reason not yet investigated).</w:t>
+            </w:r>
+          </w:p>
+        </w:tc>
+      </w:tr>
+      <w:tr>
+        <w:tc>
+          <w:tcPr>
+            <w:tcW w:type="dxa" w:w="1700"/>
+            <w:tcBorders>
+              <w:top w:val="single" w:color="999999" w:sz="4"/>
+              <w:left w:val="single" w:color="999999" w:sz="4"/>
+              <w:bottom w:val="single" w:color="999999" w:sz="4"/>
+              <w:right w:val="single" w:color="999999" w:sz="4"/>
+            </w:tcBorders>
+            <w:tcMar>
+              <w:top w:type="dxa" w:w="60"/>
+              <w:left w:type="dxa" w:w="100"/>
+              <w:bottom w:type="dxa" w:w="60"/>
+              <w:right w:type="dxa" w:w="100"/>
+            </w:tcMar>
+          </w:tcPr>
+          <w:p>
+            <w:r>
+              <w:rPr>
+                <w:rFonts w:ascii="Courier New" w:cs="Courier New" w:eastAsia="Courier New" w:hAnsi="Courier New"/>
+                <w:b w:val="false"/>
+                <w:bCs w:val="false"/>
+                <w:sz w:val="18"/>
+                <w:szCs w:val="18"/>
+              </w:rPr>
+              <w:t xml:space="preserve">09 Oct</w:t>
+            </w:r>
+          </w:p>
+        </w:tc>
+        <w:tc>
+          <w:tcPr>
+            <w:tcW w:type="dxa" w:w="7326"/>
+            <w:tcBorders>
+              <w:top w:val="single" w:color="999999" w:sz="4"/>
+              <w:left w:val="single" w:color="999999" w:sz="4"/>
+              <w:bottom w:val="single" w:color="999999" w:sz="4"/>
+              <w:right w:val="single" w:color="999999" w:sz="4"/>
+            </w:tcBorders>
+            <w:tcMar>
+              <w:top w:type="dxa" w:w="60"/>
+              <w:left w:type="dxa" w:w="100"/>
+              <w:bottom w:type="dxa" w:w="60"/>
+              <w:right w:type="dxa" w:w="100"/>
+            </w:tcMar>
+          </w:tcPr>
+          <w:p>
+            <w:r>
+              <w:rPr>
+                <w:rFonts w:ascii="Courier New" w:cs="Courier New" w:eastAsia="Courier New" w:hAnsi="Courier New"/>
+                <w:b w:val="false"/>
+                <w:bCs w:val="false"/>
+                <w:sz w:val="18"/>
+                <w:szCs w:val="18"/>
+              </w:rPr>
+              <w:t xml:space="preserve">Commit 80a1944. Registration form replaced by an enquiry form sent through Web3Forms: presence and range checks, hidden honeypot field, 3 second minimum fill time. Tested: each check, and the send path with a temporary key and a mocked request (key removed). Nothing is sent until a real access key is pasted into src/data/enquiry.js.</w:t>
+            </w:r>
+          </w:p>
+        </w:tc>
+      </w:tr>
+      <w:tr>
+        <w:tc>
+          <w:tcPr>
+            <w:tcW w:type="dxa" w:w="1700"/>
+            <w:tcBorders>
+              <w:top w:val="single" w:color="999999" w:sz="4"/>
+              <w:left w:val="single" w:color="999999" w:sz="4"/>
+              <w:bottom w:val="single" w:color="999999" w:sz="4"/>
+              <w:right w:val="single" w:color="999999" w:sz="4"/>
+            </w:tcBorders>
+            <w:tcMar>
+              <w:top w:type="dxa" w:w="60"/>
+              <w:left w:type="dxa" w:w="100"/>
+              <w:bottom w:type="dxa" w:w="60"/>
+              <w:right w:type="dxa" w:w="100"/>
+            </w:tcMar>
+          </w:tcPr>
+          <w:p>
+            <w:r>
+              <w:rPr>
+                <w:rFonts w:ascii="Courier New" w:cs="Courier New" w:eastAsia="Courier New" w:hAnsi="Courier New"/>
+                <w:b w:val="false"/>
+                <w:bCs w:val="false"/>
+                <w:sz w:val="18"/>
+                <w:szCs w:val="18"/>
+              </w:rPr>
+              <w:t xml:space="preserve">09 Oct</w:t>
+            </w:r>
+          </w:p>
+        </w:tc>
+        <w:tc>
+          <w:tcPr>
+            <w:tcW w:type="dxa" w:w="7326"/>
+            <w:tcBorders>
+              <w:top w:val="single" w:color="999999" w:sz="4"/>
+              <w:left w:val="single" w:color="999999" w:sz="4"/>
+              <w:bottom w:val="single" w:color="999999" w:sz="4"/>
+              <w:right w:val="single" w:color="999999" w:sz="4"/>
+            </w:tcBorders>
+            <w:tcMar>
+              <w:top w:type="dxa" w:w="60"/>
+              <w:left w:type="dxa" w:w="100"/>
+              <w:bottom w:type="dxa" w:w="60"/>
+              <w:right w:type="dxa" w:w="100"/>
+            </w:tcMar>
+          </w:tcPr>
+          <w:p>
+            <w:r>
+              <w:rPr>
+                <w:rFonts w:ascii="Courier New" w:cs="Courier New" w:eastAsia="Courier New" w:hAnsi="Courier New"/>
+                <w:b w:val="false"/>
+                <w:bCs w:val="false"/>
+                <w:sz w:val="18"/>
+                <w:szCs w:val="18"/>
+              </w:rPr>
+              <w:t xml:space="preserve">Commit e4867f6. Globe reworked: drag to spin with momentum, idle spin that resumes, labelled Navi Mumbai marker, caption and drag hint beside it, real globe now also on phones. Low-power test loosened (2 cores or fewer, not 4).</w:t>
             </w:r>
           </w:p>
         </w:tc>
@@ -1535,7 +1655,7 @@
                 <w:sz w:val="18"/>
                 <w:szCs w:val="18"/>
               </w:rPr>
-              <w:t xml:space="preserve">Gold-on-ink 3D globe; stats counted from data</w:t>
+              <w:t xml:space="preserve">Gold-on-ink 3D globe you can drag, labelled venue, caption beside it; stats counted from data</w:t>
             </w:r>
           </w:p>
         </w:tc>
@@ -1980,7 +2100,7 @@
                 <w:sz w:val="18"/>
                 <w:szCs w:val="18"/>
               </w:rPr>
-              <w:t xml:space="preserve">Three rows and the form</w:t>
+              <w:t xml:space="preserve">Three rows (Delegate, Delegation, Observer) and the enquiry form (Web3Forms)</w:t>
             </w:r>
           </w:p>
         </w:tc>
@@ -2410,7 +2530,7 @@
         <w:rPr>
           <w:rFonts w:ascii="Courier New" w:cs="Courier New" w:eastAsia="Courier New" w:hAnsi="Courier New"/>
         </w:rPr>
-        <w:t xml:space="preserve">Form: 6 errors on empty submit; committees filter by grade; valid submit answers "Registration is not open yet." and sends nothing.</w:t>
+        <w:t xml:space="preserve">Enquiry form: presence checks (name, email, message) and range checks (name 2-80, email valid and under 254, phone 7-15 digits if given, message 10-1000) each reject bad input with their own message.</w:t>
       </w:r>
     </w:p>
     <w:p>
@@ -2426,7 +2546,7 @@
         <w:rPr>
           <w:rFonts w:ascii="Courier New" w:cs="Courier New" w:eastAsia="Courier New" w:hAnsi="Courier New"/>
         </w:rPr>
-        <w:t xml:space="preserve">Lighthouse: Accessibility 100, Best Practices 100, SEO 100.</w:t>
+        <w:t xml:space="preserve">Enquiry form spam guards: a filled hidden field gets a fake success and sends nothing; a form sent under 3 seconds after loading is refused; a valid form posts the right fields to Web3Forms (checked with a mocked request).</w:t>
       </w:r>
     </w:p>
     <w:p>
@@ -2442,6 +2562,38 @@
         <w:rPr>
           <w:rFonts w:ascii="Courier New" w:cs="Courier New" w:eastAsia="Courier New" w:hAnsi="Courier New"/>
         </w:rPr>
+        <w:t xml:space="preserve">Globe: drag spins it with momentum; label hides when the marker is on the far side; on a 375 px phone the real globe loads, vertical scroll still works and there is no sideways overflow.</w:t>
+      </w:r>
+    </w:p>
+    <w:p>
+      <w:pPr>
+        <w:pStyle w:val="ListParagraph"/>
+        <w:numPr>
+          <w:ilvl w:val="0"/>
+          <w:numId w:val="2"/>
+        </w:numPr>
+        <w:spacing w:after="60"/>
+      </w:pPr>
+      <w:r>
+        <w:rPr>
+          <w:rFonts w:ascii="Courier New" w:cs="Courier New" w:eastAsia="Courier New" w:hAnsi="Courier New"/>
+        </w:rPr>
+        <w:t xml:space="preserve">Lighthouse: Accessibility 100, Best Practices 100, SEO 100.</w:t>
+      </w:r>
+    </w:p>
+    <w:p>
+      <w:pPr>
+        <w:pStyle w:val="ListParagraph"/>
+        <w:numPr>
+          <w:ilvl w:val="0"/>
+          <w:numId w:val="2"/>
+        </w:numPr>
+        <w:spacing w:after="60"/>
+      </w:pPr>
+      <w:r>
+        <w:rPr>
+          <w:rFonts w:ascii="Courier New" w:cs="Courier New" w:eastAsia="Courier New" w:hAnsi="Courier New"/>
+        </w:rPr>
         <w:t xml:space="preserve">Size: first load 489 kB JavaScript (161 kB compressed). Globe and hover sparkles load separately.</w:t>
       </w:r>
     </w:p>
@@ -2525,7 +2677,7 @@
         <w:rPr>
           <w:rFonts w:ascii="Courier New" w:cs="Courier New" w:eastAsia="Courier New" w:hAnsi="Courier New"/>
         </w:rPr>
-        <w:t xml:space="preserve">COPUOS used where the poster prints COPOUS.</w:t>
+        <w:t xml:space="preserve">Registration form replaced by an enquiry form (your later instruction); the fee rows stay.</w:t>
       </w:r>
     </w:p>
     <w:p>
@@ -2541,7 +2693,7 @@
         <w:rPr>
           <w:rFonts w:ascii="Courier New" w:cs="Courier New" w:eastAsia="Courier New" w:hAnsi="Courier New"/>
         </w:rPr>
-        <w:t xml:space="preserve">Globe arcs are decorative and point to no real places.</w:t>
+        <w:t xml:space="preserve">Globe runs on phones too; the brief asked for a still picture there. The still picture is now only for reduced motion or very low-power devices, with a "Spin the globe" button.</w:t>
       </w:r>
     </w:p>
     <w:p>
@@ -2557,7 +2709,7 @@
         <w:rPr>
           <w:rFonts w:ascii="Courier New" w:cs="Courier New" w:eastAsia="Courier New" w:hAnsi="Courier New"/>
         </w:rPr>
-        <w:t xml:space="preserve">Gallery and Team are two dark sections in a row, because Voices is hidden.</w:t>
+        <w:t xml:space="preserve">COPUOS used where the poster prints COPOUS.</w:t>
       </w:r>
     </w:p>
     <w:p>
@@ -2573,6 +2725,38 @@
         <w:rPr>
           <w:rFonts w:ascii="Courier New" w:cs="Courier New" w:eastAsia="Courier New" w:hAnsi="Courier New"/>
         </w:rPr>
+        <w:t xml:space="preserve">Globe arcs are decorative and point to no real places.</w:t>
+      </w:r>
+    </w:p>
+    <w:p>
+      <w:pPr>
+        <w:pStyle w:val="ListParagraph"/>
+        <w:numPr>
+          <w:ilvl w:val="0"/>
+          <w:numId w:val="2"/>
+        </w:numPr>
+        <w:spacing w:after="60"/>
+      </w:pPr>
+      <w:r>
+        <w:rPr>
+          <w:rFonts w:ascii="Courier New" w:cs="Courier New" w:eastAsia="Courier New" w:hAnsi="Courier New"/>
+        </w:rPr>
+        <w:t xml:space="preserve">Gallery and Team are two dark sections in a row, because Voices is hidden.</w:t>
+      </w:r>
+    </w:p>
+    <w:p>
+      <w:pPr>
+        <w:pStyle w:val="ListParagraph"/>
+        <w:numPr>
+          <w:ilvl w:val="0"/>
+          <w:numId w:val="2"/>
+        </w:numPr>
+        <w:spacing w:after="60"/>
+      </w:pPr>
+      <w:r>
+        <w:rPr>
+          <w:rFonts w:ascii="Courier New" w:cs="Courier New" w:eastAsia="Courier New" w:hAnsi="Courier New"/>
+        </w:rPr>
         <w:t xml:space="preserve">Committee tile names are solid cream, not outlines (outlines were unreadable on the glow).</w:t>
       </w:r>
     </w:p>
@@ -2700,7 +2884,31 @@
         <w:rPr>
           <w:rFonts w:ascii="Courier New" w:cs="Courier New" w:eastAsia="Courier New" w:hAnsi="Courier New"/>
         </w:rPr>
-        <w:t xml:space="preserve">[ ]  Registration form endpoint, and the school's agreement on where students' details go</w:t>
+        <w:t xml:space="preserve">[ ]  Web3Forms access key (paste into src/data/enquiry.js) and the inbox enquiries should go to</w:t>
+      </w:r>
+    </w:p>
+    <w:p>
+      <w:pPr>
+        <w:spacing w:after="60"/>
+        <w:ind w:left="0"/>
+      </w:pPr>
+      <w:r>
+        <w:rPr>
+          <w:rFonts w:ascii="Courier New" w:cs="Courier New" w:eastAsia="Courier New" w:hAnsi="Courier New"/>
+        </w:rPr>
+        <w:t xml:space="preserve">[ ]  The school's agreement on where enquirers' names and emails go</w:t>
+      </w:r>
+    </w:p>
+    <w:p>
+      <w:pPr>
+        <w:spacing w:after="60"/>
+        <w:ind w:left="0"/>
+      </w:pPr>
+      <w:r>
+        <w:rPr>
+          <w:rFonts w:ascii="Courier New" w:cs="Courier New" w:eastAsia="Courier New" w:hAnsi="Courier New"/>
+        </w:rPr>
+        <w:t xml:space="preserve">[ ]  Find out why the Vercel preview was blocked on the PR</w:t>
       </w:r>
     </w:p>
     <w:p>

</xml_diff>

<commit_message>
Build log: exact times through 01:03
Co-Authored-By: Claude Sonnet 5.5 <noreply@anthropic.com>
</commit_message>
<xml_diff>
--- a/docs/DYMUN26-Build-Log.docx
+++ b/docs/DYMUN26-Build-Log.docx
@@ -36,7 +36,7 @@
         <w:rPr>
           <w:rFonts w:ascii="Courier New" w:cs="Courier New" w:eastAsia="Courier New" w:hAnsi="Courier New"/>
         </w:rPr>
-        <w:t xml:space="preserve">Build session 8 to 9 October 2026, about 55 minutes. Updated after the globe rework.</w:t>
+        <w:t xml:space="preserve">Build session 8 to 9 October 2026, 23:38 to 01:03 IST (about 1 hour 25 minutes). Log covers everything up to 01:03.</w:t>
       </w:r>
     </w:p>
     <w:p>
@@ -867,7 +867,7 @@
                 <w:sz w:val="18"/>
                 <w:szCs w:val="18"/>
               </w:rPr>
-              <w:t xml:space="preserve">09 Oct</w:t>
+              <w:t xml:space="preserve">09 Oct 00:42</w:t>
             </w:r>
           </w:p>
         </w:tc>
@@ -896,7 +896,7 @@
                 <w:sz w:val="18"/>
                 <w:szCs w:val="18"/>
               </w:rPr>
-              <w:t xml:space="preserve">Build log added (HTML), then pushed to Dhruv-XYZ/2026DYMUN (branch "build" only; main left alone).</w:t>
+              <w:t xml:space="preserve">Commit 04a76db. Build log added (HTML), then pushed to Dhruv-XYZ/2026DYMUN (branch "build" only; main left alone).</w:t>
             </w:r>
           </w:p>
         </w:tc>
@@ -927,7 +927,7 @@
                 <w:sz w:val="18"/>
                 <w:szCs w:val="18"/>
               </w:rPr>
-              <w:t xml:space="preserve">09 Oct</w:t>
+              <w:t xml:space="preserve">09 Oct 00:45</w:t>
             </w:r>
           </w:p>
         </w:tc>
@@ -987,7 +987,7 @@
                 <w:sz w:val="18"/>
                 <w:szCs w:val="18"/>
               </w:rPr>
-              <w:t xml:space="preserve">09 Oct</w:t>
+              <w:t xml:space="preserve">09 Oct 00:49</w:t>
             </w:r>
           </w:p>
         </w:tc>
@@ -1047,7 +1047,7 @@
                 <w:sz w:val="18"/>
                 <w:szCs w:val="18"/>
               </w:rPr>
-              <w:t xml:space="preserve">09 Oct</w:t>
+              <w:t xml:space="preserve">09 Oct 00:52</w:t>
             </w:r>
           </w:p>
         </w:tc>
@@ -1076,7 +1076,7 @@
                 <w:sz w:val="18"/>
                 <w:szCs w:val="18"/>
               </w:rPr>
-              <w:t xml:space="preserve">This log (Word, Courier New) added on branch docs/build-log; pull request 1 opened into main. Vercel preview check reports "Deployment was blocked" (not caused by the log; reason not yet investigated).</w:t>
+              <w:t xml:space="preserve">Commit 4d52f6a. This log (Word, Courier New) added on branch docs/build-log; pull request 1 opened into main. Vercel preview check reports "Deployment was blocked" (not caused by the log; reason not yet investigated).</w:t>
             </w:r>
           </w:p>
         </w:tc>
@@ -1107,7 +1107,7 @@
                 <w:sz w:val="18"/>
                 <w:szCs w:val="18"/>
               </w:rPr>
-              <w:t xml:space="preserve">09 Oct</w:t>
+              <w:t xml:space="preserve">09 Oct 00:57</w:t>
             </w:r>
           </w:p>
         </w:tc>
@@ -1167,7 +1167,7 @@
                 <w:sz w:val="18"/>
                 <w:szCs w:val="18"/>
               </w:rPr>
-              <w:t xml:space="preserve">09 Oct</w:t>
+              <w:t xml:space="preserve">09 Oct 01:03</w:t>
             </w:r>
           </w:p>
         </w:tc>
@@ -1197,6 +1197,66 @@
                 <w:szCs w:val="18"/>
               </w:rPr>
               <w:t xml:space="preserve">Commit e4867f6. Globe reworked: drag to spin with momentum, idle spin that resumes, labelled Navi Mumbai marker, caption and drag hint beside it, real globe now also on phones. Low-power test loosened (2 cores or fewer, not 4).</w:t>
+            </w:r>
+          </w:p>
+        </w:tc>
+      </w:tr>
+      <w:tr>
+        <w:tc>
+          <w:tcPr>
+            <w:tcW w:type="dxa" w:w="1700"/>
+            <w:tcBorders>
+              <w:top w:val="single" w:color="999999" w:sz="4"/>
+              <w:left w:val="single" w:color="999999" w:sz="4"/>
+              <w:bottom w:val="single" w:color="999999" w:sz="4"/>
+              <w:right w:val="single" w:color="999999" w:sz="4"/>
+            </w:tcBorders>
+            <w:tcMar>
+              <w:top w:type="dxa" w:w="60"/>
+              <w:left w:type="dxa" w:w="100"/>
+              <w:bottom w:type="dxa" w:w="60"/>
+              <w:right w:type="dxa" w:w="100"/>
+            </w:tcMar>
+          </w:tcPr>
+          <w:p>
+            <w:r>
+              <w:rPr>
+                <w:rFonts w:ascii="Courier New" w:cs="Courier New" w:eastAsia="Courier New" w:hAnsi="Courier New"/>
+                <w:b w:val="false"/>
+                <w:bCs w:val="false"/>
+                <w:sz w:val="18"/>
+                <w:szCs w:val="18"/>
+              </w:rPr>
+              <w:t xml:space="preserve">09 Oct 01:08</w:t>
+            </w:r>
+          </w:p>
+        </w:tc>
+        <w:tc>
+          <w:tcPr>
+            <w:tcW w:type="dxa" w:w="7326"/>
+            <w:tcBorders>
+              <w:top w:val="single" w:color="999999" w:sz="4"/>
+              <w:left w:val="single" w:color="999999" w:sz="4"/>
+              <w:bottom w:val="single" w:color="999999" w:sz="4"/>
+              <w:right w:val="single" w:color="999999" w:sz="4"/>
+            </w:tcBorders>
+            <w:tcMar>
+              <w:top w:type="dxa" w:w="60"/>
+              <w:left w:type="dxa" w:w="100"/>
+              <w:bottom w:type="dxa" w:w="60"/>
+              <w:right w:type="dxa" w:w="100"/>
+            </w:tcMar>
+          </w:tcPr>
+          <w:p>
+            <w:r>
+              <w:rPr>
+                <w:rFonts w:ascii="Courier New" w:cs="Courier New" w:eastAsia="Courier New" w:hAnsi="Courier New"/>
+                <w:b w:val="false"/>
+                <w:bCs w:val="false"/>
+                <w:sz w:val="18"/>
+                <w:szCs w:val="18"/>
+              </w:rPr>
+              <w:t xml:space="preserve">Everything committed and pushed to PixelWebsites/DYMUN2026. This log merged onto main; PR 1 closes as merged.</w:t>
             </w:r>
           </w:p>
         </w:tc>

</xml_diff>